<commit_message>
Refresh set-up guide screenshots for the new dashboard design
Co-Authored-By: Claude Sonnet 5.5 <noreply@anthropic.com>
</commit_message>
<xml_diff>
--- a/docs/QA-Agent-Team-Setup-Guide.docx
+++ b/docs/QA-Agent-Team-Setup-Guide.docx
@@ -1906,7 +1906,7 @@
       <w:r>
         <w:drawing>
           <wp:inline distT="0" distB="0" distL="0" distR="0">
-            <wp:extent cx="5715000" cy="2238375"/>
+            <wp:extent cx="5715000" cy="2476500"/>
             <wp:effectExtent t="0" r="0" b="0" l="0"/>
             <wp:docPr id="7" name="The dashboard. Start a run from the “New run” box on the left" descr="The dashboard. Start a run from the “New run” box on the left" title="The dashboard. Start a run from the “New run” box on the left"/>
             <wp:cNvGraphicFramePr>
@@ -1931,7 +1931,7 @@
                   <pic:spPr bwMode="auto">
                     <a:xfrm>
                       <a:off x="0" y="0"/>
-                      <a:ext cx="5715000" cy="2238375"/>
+                      <a:ext cx="5715000" cy="2476500"/>
                     </a:xfrm>
                     <a:prstGeom prst="rect">
                       <a:avLst/>
@@ -2592,7 +2592,7 @@
       <w:r>
         <w:drawing>
           <wp:inline distT="0" distB="0" distL="0" distR="0">
-            <wp:extent cx="5715000" cy="4762500"/>
+            <wp:extent cx="5715000" cy="5238750"/>
             <wp:effectExtent t="0" r="0" b="0" l="0"/>
             <wp:docPr id="9" name="A finished run. Reports are listed under Outputs, with a coverage summary below" descr="A finished run. Reports are listed under Outputs, with a coverage summary below" title="A finished run. Reports are listed under Outputs, with a coverage summary below"/>
             <wp:cNvGraphicFramePr>
@@ -2617,7 +2617,7 @@
                   <pic:spPr bwMode="auto">
                     <a:xfrm>
                       <a:off x="0" y="0"/>
-                      <a:ext cx="5715000" cy="4762500"/>
+                      <a:ext cx="5715000" cy="5238750"/>
                     </a:xfrm>
                     <a:prstGeom prst="rect">
                       <a:avLst/>

</xml_diff>

<commit_message>
Refresh set-up guide screenshots for the new dashboard design (#7)
Co-authored-by: Ketan Ranmal <ketanranmal@mac.lan>
Co-authored-by: Claude Sonnet 5.5 <noreply@anthropic.com>
</commit_message>
<xml_diff>
--- a/docs/QA-Agent-Team-Setup-Guide.docx
+++ b/docs/QA-Agent-Team-Setup-Guide.docx
@@ -1906,7 +1906,7 @@
       <w:r>
         <w:drawing>
           <wp:inline distT="0" distB="0" distL="0" distR="0">
-            <wp:extent cx="5715000" cy="2238375"/>
+            <wp:extent cx="5715000" cy="2476500"/>
             <wp:effectExtent t="0" r="0" b="0" l="0"/>
             <wp:docPr id="7" name="The dashboard. Start a run from the “New run” box on the left" descr="The dashboard. Start a run from the “New run” box on the left" title="The dashboard. Start a run from the “New run” box on the left"/>
             <wp:cNvGraphicFramePr>
@@ -1931,7 +1931,7 @@
                   <pic:spPr bwMode="auto">
                     <a:xfrm>
                       <a:off x="0" y="0"/>
-                      <a:ext cx="5715000" cy="2238375"/>
+                      <a:ext cx="5715000" cy="2476500"/>
                     </a:xfrm>
                     <a:prstGeom prst="rect">
                       <a:avLst/>
@@ -2592,7 +2592,7 @@
       <w:r>
         <w:drawing>
           <wp:inline distT="0" distB="0" distL="0" distR="0">
-            <wp:extent cx="5715000" cy="4762500"/>
+            <wp:extent cx="5715000" cy="5238750"/>
             <wp:effectExtent t="0" r="0" b="0" l="0"/>
             <wp:docPr id="9" name="A finished run. Reports are listed under Outputs, with a coverage summary below" descr="A finished run. Reports are listed under Outputs, with a coverage summary below" title="A finished run. Reports are listed under Outputs, with a coverage summary below"/>
             <wp:cNvGraphicFramePr>
@@ -2617,7 +2617,7 @@
                   <pic:spPr bwMode="auto">
                     <a:xfrm>
                       <a:off x="0" y="0"/>
-                      <a:ext cx="5715000" cy="4762500"/>
+                      <a:ext cx="5715000" cy="5238750"/>
                     </a:xfrm>
                     <a:prstGeom prst="rect">
                       <a:avLst/>

</xml_diff>